<commit_message>
ALmaze 1.0.0 : README et manuel à jour du nouveau nom
Co-Authored-By: Claude Opus 5.5 <noreply@anthropic.com>
</commit_message>
<xml_diff>
--- a/docs/manuel-almaze.docx
+++ b/docs/manuel-almaze.docx
@@ -102,7 +102,7 @@
           <w:sz w:val="22"/>
           <w:szCs w:val="22"/>
         </w:rPr>
-        <w:t xml:space="preserve">Version 0.7.0 · octobre 2026</w:t>
+        <w:t xml:space="preserve">Version 1.0.0 · octobre 2026</w:t>
       </w:r>
     </w:p>
     <w:p>
@@ -594,7 +594,7 @@
       <w:r>
         <w:t xml:space="preserve"> depuis la page des </w:t>
       </w:r>
-      <w:hyperlink w:history="1" r:id="rId3pzioz_cll5ons0uxo78p">
+      <w:hyperlink w:history="1" r:id="rIdml60v-ew_qvc6uzpeb6uv">
         <w:r>
           <w:rPr>
             <w:rStyle w:val="Hyperlink"/>
@@ -715,7 +715,7 @@
         <w:t xml:space="preserve">AL Object Browser</w:t>
       </w:r>
       <w:r>
-        <w:t xml:space="preserve">. La mise à jour vers ALmaze désinstalle l’ancienne version ; vos réglages, vos récents, l’index des corpus et la connexion GitHub sont conservés.</w:t>
+        <w:t xml:space="preserve">. La mise à jour vers ALmaze 1.0 désinstalle l’ancienne version ; vos réglages, vos récents, l’index des corpus et la connexion GitHub sont conservés.</w:t>
       </w:r>
     </w:p>
     <w:p>

</xml_diff>

<commit_message>
Manuel et site de la version 1.4.0
Co-Authored-By: Claude Opus 5.5 <noreply@anthropic.com>
</commit_message>
<xml_diff>
--- a/docs/manuel-almaze.docx
+++ b/docs/manuel-almaze.docx
@@ -102,7 +102,7 @@
           <w:sz w:val="22"/>
           <w:szCs w:val="22"/>
         </w:rPr>
-        <w:t xml:space="preserve">Version 1.3.0 · octobre 2026</w:t>
+        <w:t xml:space="preserve">Version 1.4.0 · octobre 2026</w:t>
       </w:r>
     </w:p>
     <w:p>
@@ -144,7 +144,7 @@
             <w:sz w:val="23"/>
             <w:szCs w:val="23"/>
           </w:rPr>
-          <w:t xml:space="preserve">2.  Nouveautés de la version 1.3</w:t>
+          <w:t xml:space="preserve">2.  Nouveautés de la version 1.4</w:t>
         </w:r>
       </w:hyperlink>
     </w:p>
@@ -732,7 +732,7 @@
       </w:pPr>
       <w:bookmarkStart w:name="nouveautes" w:id="1"/>
       <w:r>
-        <w:t xml:space="preserve">2. Nouveautés de la version 1.3</w:t>
+        <w:t xml:space="preserve">2. Nouveautés de la version 1.4</w:t>
       </w:r>
       <w:bookmarkEnd w:id="1"/>
     </w:p>
@@ -741,7 +741,17 @@
         <w:spacing w:after="140" w:line="300"/>
       </w:pPr>
       <w:r>
-        <w:t xml:space="preserve">La version 1.3 refond l’interface, sans changer ce qu’elle permet de faire :</w:t>
+        <w:t xml:space="preserve">La version 1.4 aide le consultant à définir les </w:t>
+      </w:r>
+      <w:r>
+        <w:rPr>
+          <w:b/>
+          <w:bCs/>
+        </w:rPr>
+        <w:t xml:space="preserve">cues</w:t>
+      </w:r>
+      <w:r>
+        <w:t xml:space="preserve"> d’un Role Center (voir Composer un Role Center) :</w:t>
       </w:r>
     </w:p>
     <w:p>
@@ -758,35 +768,10 @@
           <w:b/>
           <w:bCs/>
         </w:rPr>
-        <w:t xml:space="preserve">En-tête d’objet compact</w:t>
-      </w:r>
-      <w:r>
-        <w:t xml:space="preserve"> : les actions de l’objet tiennent sur une ligne, en icônes quand la place manque, le surplus dans un menu </w:t>
-      </w:r>
-      <w:r>
-        <w:rPr>
-          <w:b/>
-          <w:bCs/>
-        </w:rPr>
-        <w:t xml:space="preserve">…</w:t>
-      </w:r>
-      <w:r>
-        <w:t xml:space="preserve"> ; une seule recherche de membres, </w:t>
-      </w:r>
-      <w:r>
-        <w:rPr>
-          <w:rFonts w:ascii="Cascadia Mono" w:cs="Cascadia Mono" w:eastAsia="Cascadia Mono" w:hAnsi="Cascadia Mono"/>
-          <w:b/>
-          <w:bCs/>
-          <w:color w:val="1F2933"/>
-          <w:sz w:val="18"/>
-          <w:szCs w:val="18"/>
-          <w:shd w:fill="E3E7ED" w:color="auto" w:val="clear"/>
-        </w:rPr>
-        <w:t xml:space="preserve"> Ctrl+F </w:t>
-      </w:r>
-      <w:r>
-        <w:t xml:space="preserve"> (voir Lire le code).</w:t>
+        <w:t xml:space="preserve">Cue à développer</w:t>
+      </w:r>
+      <w:r>
+        <w:t xml:space="preserve"> : un formulaire décrit le cue en français (valeur, table, filtres, page ouverte au clic, groupe, largeur, seuils) au lieu d’un texte libre.</w:t>
       </w:r>
     </w:p>
     <w:p>
@@ -803,50 +788,10 @@
           <w:b/>
           <w:bCs/>
         </w:rPr>
-        <w:t xml:space="preserve">Panneaux du bas</w:t>
-      </w:r>
-      <w:r>
-        <w:t xml:space="preserve"> : même en-tête partout (titre, compteur, </w:t>
-      </w:r>
-      <w:r>
-        <w:rPr>
-          <w:b/>
-          <w:bCs/>
-        </w:rPr>
-        <w:t xml:space="preserve">Exporter…</w:t>
-      </w:r>
-      <w:r>
-        <w:t xml:space="preserve">, Détacher, Fermer), onglets intégrés, filtres </w:t>
-      </w:r>
-      <w:r>
-        <w:rPr>
-          <w:b/>
-          <w:bCs/>
-        </w:rPr>
-        <w:t xml:space="preserve">Inclure :</w:t>
-      </w:r>
-      <w:r>
-        <w:t xml:space="preserve"> et choix </w:t>
-      </w:r>
-      <w:r>
-        <w:rPr>
-          <w:b/>
-          <w:bCs/>
-        </w:rPr>
-        <w:t xml:space="preserve">Apps du corpus</w:t>
-      </w:r>
-      <w:r>
-        <w:t xml:space="preserve"> / </w:t>
-      </w:r>
-      <w:r>
-        <w:rPr>
-          <w:b/>
-          <w:bCs/>
-        </w:rPr>
-        <w:t xml:space="preserve">Toutes les apps</w:t>
-      </w:r>
-      <w:r>
-        <w:t xml:space="preserve">.</w:t>
+        <w:t xml:space="preserve">Cues existants</w:t>
+      </w:r>
+      <w:r>
+        <w:t xml:space="preserve"> proposés d’abord : ALmaze lit ce que compte chaque cue du corpus et propose ceux qui ressemblent à la demande, pour placer leur part ou les reprendre dans la sienne.</w:t>
       </w:r>
     </w:p>
     <w:p>
@@ -859,29 +804,27 @@
         <w:spacing w:after="60" w:line="290"/>
       </w:pPr>
       <w:r>
-        <w:rPr>
-          <w:b/>
-          <w:bCs/>
-        </w:rPr>
-        <w:t xml:space="preserve">Dialogues</w:t>
-      </w:r>
-      <w:r>
-        <w:t xml:space="preserve"> homogènes : croix en haut à droite, </w:t>
-      </w:r>
-      <w:r>
-        <w:rPr>
-          <w:rFonts w:ascii="Cascadia Mono" w:cs="Cascadia Mono" w:eastAsia="Cascadia Mono" w:hAnsi="Cascadia Mono"/>
-          <w:b/>
-          <w:bCs/>
-          <w:color w:val="1F2933"/>
-          <w:sz w:val="18"/>
-          <w:szCs w:val="18"/>
-          <w:shd w:fill="E3E7ED" w:color="auto" w:val="clear"/>
-        </w:rPr>
-        <w:t xml:space="preserve"> Échap </w:t>
-      </w:r>
-      <w:r>
-        <w:t xml:space="preserve"> ou un clic à côté pour fermer, focus gardé dans le dialogue.</w:t>
+        <w:t xml:space="preserve">Dans le designer, chaque cue à développer est une </w:t>
+      </w:r>
+      <w:r>
+        <w:rPr>
+          <w:b/>
+          <w:bCs/>
+        </w:rPr>
+        <w:t xml:space="preserve">tuile</w:t>
+      </w:r>
+      <w:r>
+        <w:t xml:space="preserve"> de sa part ; le ticket les décrit dans une section </w:t>
+      </w:r>
+      <w:r>
+        <w:rPr>
+          <w:b/>
+          <w:bCs/>
+        </w:rPr>
+        <w:t xml:space="preserve">Cues à développer</w:t>
+      </w:r>
+      <w:r>
+        <w:t xml:space="preserve">, un tableau par part.</w:t>
       </w:r>
     </w:p>
     <w:p>
@@ -894,14 +837,45 @@
         <w:spacing w:after="60" w:line="290"/>
       </w:pPr>
       <w:r>
-        <w:rPr>
-          <w:b/>
-          <w:bCs/>
-        </w:rPr>
-        <w:t xml:space="preserve">Notifications</w:t>
-      </w:r>
-      <w:r>
-        <w:t xml:space="preserve"> empilées en bas à droite : indexation, échec de l’ouverture dans VS Code, mise à jour disponible.</w:t>
+        <w:t xml:space="preserve">Vue fonctionnelle : la </w:t>
+      </w:r>
+      <w:r>
+        <w:rPr>
+          <w:b/>
+          <w:bCs/>
+        </w:rPr>
+        <w:t xml:space="preserve">structure</w:t>
+      </w:r>
+      <w:r>
+        <w:t xml:space="preserve"> des objets sans écran (tables, états, codeunits…), les </w:t>
+      </w:r>
+      <w:r>
+        <w:rPr>
+          <w:b/>
+          <w:bCs/>
+        </w:rPr>
+        <w:t xml:space="preserve">onglets</w:t>
+      </w:r>
+      <w:r>
+        <w:t xml:space="preserve"> et les </w:t>
+      </w:r>
+      <w:r>
+        <w:rPr>
+          <w:b/>
+          <w:bCs/>
+        </w:rPr>
+        <w:t xml:space="preserve">FactBox</w:t>
+      </w:r>
+      <w:r>
+        <w:t xml:space="preserve"> d’un écran.</w:t>
+      </w:r>
+    </w:p>
+    <w:p>
+      <w:pPr>
+        <w:spacing w:after="140" w:line="300"/>
+      </w:pPr>
+      <w:r>
+        <w:t xml:space="preserve">La version 1.3 a refondu l’interface, sans changer ce qu’elle permet de faire :</w:t>
       </w:r>
     </w:p>
     <w:p>
@@ -918,20 +892,35 @@
           <w:b/>
           <w:bCs/>
         </w:rPr>
-        <w:t xml:space="preserve">Diagrammes</w:t>
-      </w:r>
-      <w:r>
-        <w:t xml:space="preserve"> lisibles à l’ouverture, libellés des liens au survol, bouton </w:t>
-      </w:r>
-      <w:r>
-        <w:rPr>
-          <w:b/>
-          <w:bCs/>
-        </w:rPr>
-        <w:t xml:space="preserve">Ajuster</w:t>
-      </w:r>
-      <w:r>
-        <w:t xml:space="preserve"> pour la vue d’ensemble.</w:t>
+        <w:t xml:space="preserve">En-tête d’objet compact</w:t>
+      </w:r>
+      <w:r>
+        <w:t xml:space="preserve"> : les actions de l’objet tiennent sur une ligne, en icônes quand la place manque, le surplus dans un menu </w:t>
+      </w:r>
+      <w:r>
+        <w:rPr>
+          <w:b/>
+          <w:bCs/>
+        </w:rPr>
+        <w:t xml:space="preserve">…</w:t>
+      </w:r>
+      <w:r>
+        <w:t xml:space="preserve"> ; une seule recherche de membres, </w:t>
+      </w:r>
+      <w:r>
+        <w:rPr>
+          <w:rFonts w:ascii="Cascadia Mono" w:cs="Cascadia Mono" w:eastAsia="Cascadia Mono" w:hAnsi="Cascadia Mono"/>
+          <w:b/>
+          <w:bCs/>
+          <w:color w:val="1F2933"/>
+          <w:sz w:val="18"/>
+          <w:szCs w:val="18"/>
+          <w:shd w:fill="E3E7ED" w:color="auto" w:val="clear"/>
+        </w:rPr>
+        <w:t xml:space="preserve"> Ctrl+F </w:t>
+      </w:r>
+      <w:r>
+        <w:t xml:space="preserve"> (voir Lire le code).</w:t>
       </w:r>
     </w:p>
     <w:p>
@@ -944,17 +933,54 @@
         <w:spacing w:after="60" w:line="290"/>
       </w:pPr>
       <w:r>
-        <w:t xml:space="preserve">Thème </w:t>
-      </w:r>
-      <w:r>
-        <w:rPr>
-          <w:b/>
-          <w:bCs/>
-        </w:rPr>
-        <w:t xml:space="preserve">Sombre</w:t>
-      </w:r>
-      <w:r>
-        <w:t xml:space="preserve"> (anciennement « Dark mode »), contrastes renforcés dans les trois thèmes, icônes uniformes.</w:t>
+        <w:rPr>
+          <w:b/>
+          <w:bCs/>
+        </w:rPr>
+        <w:t xml:space="preserve">Panneaux du bas</w:t>
+      </w:r>
+      <w:r>
+        <w:t xml:space="preserve"> : même en-tête partout (titre, compteur, </w:t>
+      </w:r>
+      <w:r>
+        <w:rPr>
+          <w:b/>
+          <w:bCs/>
+        </w:rPr>
+        <w:t xml:space="preserve">Exporter…</w:t>
+      </w:r>
+      <w:r>
+        <w:t xml:space="preserve">, Détacher, Fermer), onglets intégrés, filtres </w:t>
+      </w:r>
+      <w:r>
+        <w:rPr>
+          <w:b/>
+          <w:bCs/>
+        </w:rPr>
+        <w:t xml:space="preserve">Inclure :</w:t>
+      </w:r>
+      <w:r>
+        <w:t xml:space="preserve"> et choix </w:t>
+      </w:r>
+      <w:r>
+        <w:rPr>
+          <w:b/>
+          <w:bCs/>
+        </w:rPr>
+        <w:t xml:space="preserve">Apps du corpus</w:t>
+      </w:r>
+      <w:r>
+        <w:t xml:space="preserve"> / </w:t>
+      </w:r>
+      <w:r>
+        <w:rPr>
+          <w:b/>
+          <w:bCs/>
+        </w:rPr>
+        <w:t xml:space="preserve">Toutes les apps</w:t>
+      </w:r>
+      <w:r>
+        <w:t xml:space="preserve">.</w:t>
       </w:r>
     </w:p>
     <w:p>
@@ -967,6 +993,114 @@
         <w:spacing w:after="60" w:line="290"/>
       </w:pPr>
       <w:r>
+        <w:rPr>
+          <w:b/>
+          <w:bCs/>
+        </w:rPr>
+        <w:t xml:space="preserve">Dialogues</w:t>
+      </w:r>
+      <w:r>
+        <w:t xml:space="preserve"> homogènes : croix en haut à droite, </w:t>
+      </w:r>
+      <w:r>
+        <w:rPr>
+          <w:rFonts w:ascii="Cascadia Mono" w:cs="Cascadia Mono" w:eastAsia="Cascadia Mono" w:hAnsi="Cascadia Mono"/>
+          <w:b/>
+          <w:bCs/>
+          <w:color w:val="1F2933"/>
+          <w:sz w:val="18"/>
+          <w:szCs w:val="18"/>
+          <w:shd w:fill="E3E7ED" w:color="auto" w:val="clear"/>
+        </w:rPr>
+        <w:t xml:space="preserve"> Échap </w:t>
+      </w:r>
+      <w:r>
+        <w:t xml:space="preserve"> ou un clic à côté pour fermer, focus gardé dans le dialogue.</w:t>
+      </w:r>
+    </w:p>
+    <w:p>
+      <w:pPr>
+        <w:pStyle w:val="ListParagraph"/>
+        <w:numPr>
+          <w:ilvl w:val="0"/>
+          <w:numId w:val="2"/>
+        </w:numPr>
+        <w:spacing w:after="60" w:line="290"/>
+      </w:pPr>
+      <w:r>
+        <w:rPr>
+          <w:b/>
+          <w:bCs/>
+        </w:rPr>
+        <w:t xml:space="preserve">Notifications</w:t>
+      </w:r>
+      <w:r>
+        <w:t xml:space="preserve"> empilées en bas à droite : indexation, échec de l’ouverture dans VS Code, mise à jour disponible.</w:t>
+      </w:r>
+    </w:p>
+    <w:p>
+      <w:pPr>
+        <w:pStyle w:val="ListParagraph"/>
+        <w:numPr>
+          <w:ilvl w:val="0"/>
+          <w:numId w:val="2"/>
+        </w:numPr>
+        <w:spacing w:after="60" w:line="290"/>
+      </w:pPr>
+      <w:r>
+        <w:rPr>
+          <w:b/>
+          <w:bCs/>
+        </w:rPr>
+        <w:t xml:space="preserve">Diagrammes</w:t>
+      </w:r>
+      <w:r>
+        <w:t xml:space="preserve"> lisibles à l’ouverture, libellés des liens au survol, bouton </w:t>
+      </w:r>
+      <w:r>
+        <w:rPr>
+          <w:b/>
+          <w:bCs/>
+        </w:rPr>
+        <w:t xml:space="preserve">Ajuster</w:t>
+      </w:r>
+      <w:r>
+        <w:t xml:space="preserve"> pour la vue d’ensemble.</w:t>
+      </w:r>
+    </w:p>
+    <w:p>
+      <w:pPr>
+        <w:pStyle w:val="ListParagraph"/>
+        <w:numPr>
+          <w:ilvl w:val="0"/>
+          <w:numId w:val="2"/>
+        </w:numPr>
+        <w:spacing w:after="60" w:line="290"/>
+      </w:pPr>
+      <w:r>
+        <w:t xml:space="preserve">Thème </w:t>
+      </w:r>
+      <w:r>
+        <w:rPr>
+          <w:b/>
+          <w:bCs/>
+        </w:rPr>
+        <w:t xml:space="preserve">Sombre</w:t>
+      </w:r>
+      <w:r>
+        <w:t xml:space="preserve"> (anciennement « Dark mode »), contrastes renforcés dans les trois thèmes, icônes uniformes.</w:t>
+      </w:r>
+    </w:p>
+    <w:p>
+      <w:pPr>
+        <w:pStyle w:val="ListParagraph"/>
+        <w:numPr>
+          <w:ilvl w:val="0"/>
+          <w:numId w:val="2"/>
+        </w:numPr>
+        <w:spacing w:after="60" w:line="290"/>
+      </w:pPr>
+      <w:r>
         <w:t xml:space="preserve">Événements : la colonne </w:t>
       </w:r>
       <w:r>
@@ -1099,7 +1233,7 @@
       <w:r>
         <w:t xml:space="preserve"> depuis la page des </w:t>
       </w:r>
-      <w:hyperlink w:history="1" r:id="rIdeqq8hotiy9qtb28ufuwty">
+      <w:hyperlink w:history="1" r:id="rIdw7lfgny6p0omgdx2upgzh">
         <w:r>
           <w:rPr>
             <w:rStyle w:val="Hyperlink"/>
@@ -5189,7 +5323,27 @@
         <w:t xml:space="preserve">Masquer le code</w:t>
       </w:r>
       <w:r>
-        <w:t xml:space="preserve"> revient à l’écran. Les autres objets (tables, codeunits…) n’ont pas d’écran : leur code est masqué, avec un bouton pour l’afficher.</w:t>
+        <w:t xml:space="preserve"> revient à l’écran. Sur l’écran, un champ lié à la table montre son ID et son nom technique ; les sous-écrans sont listés sous </w:t>
+      </w:r>
+      <w:r>
+        <w:rPr>
+          <w:b/>
+          <w:bCs/>
+        </w:rPr>
+        <w:t xml:space="preserve">Onglets</w:t>
+      </w:r>
+      <w:r>
+        <w:t xml:space="preserve"> et les parties de la zone FactBox sous </w:t>
+      </w:r>
+      <w:r>
+        <w:rPr>
+          <w:b/>
+          <w:bCs/>
+        </w:rPr>
+        <w:t xml:space="preserve">FactBox</w:t>
+      </w:r>
+      <w:r>
+        <w:t xml:space="preserve">. Les autres objets (tables, états, codeunits…) n’ont pas d’écran : ils s’ouvrent sur leur structure compacte — champs (ID, nom, type), valeurs d’enum, dataitems et colonnes, variables globales (nom, type) ; un clic sur une ligne affiche le code à cette ligne.</w:t>
       </w:r>
     </w:p>
     <w:p>
@@ -7520,7 +7674,7 @@
         <w:t xml:space="preserve">à développer</w:t>
       </w:r>
       <w:r>
-        <w:t xml:space="preserve"> décrit en texte libre un élément qui n’existe pas encore (nouveau cue, nouvelle part) : un squelette en pointillés étiqueté </w:t>
+        <w:t xml:space="preserve"> décrit en texte libre un élément qui n’existe pas encore (une nouvelle part, par exemple) : un squelette en pointillés étiqueté </w:t>
       </w:r>
       <w:r>
         <w:rPr>
@@ -7530,7 +7684,17 @@
         <w:t xml:space="preserve">à développer</w:t>
       </w:r>
       <w:r>
-        <w:t xml:space="preserve">, qui devient une ligne du ticket, pas du code. Une pastille signale un élément </w:t>
+        <w:t xml:space="preserve">, qui devient une ligne du ticket, pas du code. Un nouveau cue se décrit plutôt en </w:t>
+      </w:r>
+      <w:r>
+        <w:rPr>
+          <w:b/>
+          <w:bCs/>
+        </w:rPr>
+        <w:t xml:space="preserve">cue à développer</w:t>
+      </w:r>
+      <w:r>
+        <w:t xml:space="preserve"> (ci-dessous). Une pastille signale un élément </w:t>
       </w:r>
       <w:r>
         <w:rPr>
@@ -7707,6 +7871,274 @@
         <w:spacing w:after="140" w:line="300"/>
       </w:pPr>
       <w:r>
+        <w:t xml:space="preserve">Un </w:t>
+      </w:r>
+      <w:r>
+        <w:rPr>
+          <w:b/>
+          <w:bCs/>
+        </w:rPr>
+        <w:t xml:space="preserve">cue à développer</w:t>
+      </w:r>
+      <w:r>
+        <w:t xml:space="preserve"> décrit un cue qui n’existe pas encore, sans connaître les noms AL. </w:t>
+      </w:r>
+      <w:r>
+        <w:rPr>
+          <w:b/>
+          <w:bCs/>
+        </w:rPr>
+        <w:t xml:space="preserve">+ cue</w:t>
+      </w:r>
+      <w:r>
+        <w:t xml:space="preserve"> sur une part Activités (ou </w:t>
+      </w:r>
+      <w:r>
+        <w:rPr>
+          <w:b/>
+          <w:bCs/>
+        </w:rPr>
+        <w:t xml:space="preserve">+ part de cues</w:t>
+      </w:r>
+      <w:r>
+        <w:t xml:space="preserve"> dans le Contenu, </w:t>
+      </w:r>
+      <w:r>
+        <w:rPr>
+          <w:b/>
+          <w:bCs/>
+        </w:rPr>
+        <w:t xml:space="preserve">Cue à développer</w:t>
+      </w:r>
+      <w:r>
+        <w:t xml:space="preserve"> dans la Vue liste) l’ajoute et ouvre son formulaire à droite :</w:t>
+      </w:r>
+    </w:p>
+    <w:p>
+      <w:pPr>
+        <w:pStyle w:val="ListParagraph"/>
+        <w:numPr>
+          <w:ilvl w:val="0"/>
+          <w:numId w:val="2"/>
+        </w:numPr>
+        <w:spacing w:after="60" w:line="290"/>
+      </w:pPr>
+      <w:r>
+        <w:t xml:space="preserve">en tête, les </w:t>
+      </w:r>
+      <w:r>
+        <w:rPr>
+          <w:b/>
+          <w:bCs/>
+        </w:rPr>
+        <w:t xml:space="preserve">cues existants</w:t>
+      </w:r>
+      <w:r>
+        <w:t xml:space="preserve"> du corpus qui ressemblent à la demande (même table d’abord, puis caption), décrits en français : « Nombre de *Commandes vente* où *Statut* = Lancé ». </w:t>
+      </w:r>
+      <w:r>
+        <w:rPr>
+          <w:b/>
+          <w:bCs/>
+        </w:rPr>
+        <w:t xml:space="preserve">Placer sa part</w:t>
+      </w:r>
+      <w:r>
+        <w:t xml:space="preserve"> ajoute la part entière au Contenu ; </w:t>
+      </w:r>
+      <w:r>
+        <w:rPr>
+          <w:b/>
+          <w:bCs/>
+        </w:rPr>
+        <w:t xml:space="preserve">Reprendre dans ma part</w:t>
+      </w:r>
+      <w:r>
+        <w:t xml:space="preserve"> préremplit le cue (valeur, table, filtres, page, largeur), à ajuster. La liste se remplit au fil de la lecture des parts du corpus ;</w:t>
+      </w:r>
+    </w:p>
+    <w:p>
+      <w:pPr>
+        <w:pStyle w:val="ListParagraph"/>
+        <w:numPr>
+          <w:ilvl w:val="0"/>
+          <w:numId w:val="2"/>
+        </w:numPr>
+        <w:spacing w:after="60" w:line="290"/>
+      </w:pPr>
+      <w:r>
+        <w:t xml:space="preserve">la </w:t>
+      </w:r>
+      <w:r>
+        <w:rPr>
+          <w:b/>
+          <w:bCs/>
+        </w:rPr>
+        <w:t xml:space="preserve">caption</w:t>
+      </w:r>
+      <w:r>
+        <w:t xml:space="preserve">, la </w:t>
+      </w:r>
+      <w:r>
+        <w:rPr>
+          <w:b/>
+          <w:bCs/>
+        </w:rPr>
+        <w:t xml:space="preserve">valeur</w:t>
+      </w:r>
+      <w:r>
+        <w:t xml:space="preserve"> (nombre d’enregistrements, somme d’un champ, ou calculée par code, décrite en texte), la </w:t>
+      </w:r>
+      <w:r>
+        <w:rPr>
+          <w:b/>
+          <w:bCs/>
+        </w:rPr>
+        <w:t xml:space="preserve">table</w:t>
+      </w:r>
+      <w:r>
+        <w:t xml:space="preserve"> cherchée par sa caption française (ou saisie libre si elle n’existe pas encore) ;</w:t>
+      </w:r>
+    </w:p>
+    <w:p>
+      <w:pPr>
+        <w:pStyle w:val="ListParagraph"/>
+        <w:numPr>
+          <w:ilvl w:val="0"/>
+          <w:numId w:val="2"/>
+        </w:numPr>
+        <w:spacing w:after="60" w:line="290"/>
+      </w:pPr>
+      <w:r>
+        <w:t xml:space="preserve">les </w:t>
+      </w:r>
+      <w:r>
+        <w:rPr>
+          <w:b/>
+          <w:bCs/>
+        </w:rPr>
+        <w:t xml:space="preserve">filtres</w:t>
+      </w:r>
+      <w:r>
+        <w:t xml:space="preserve">, une condition par champ, combinées par ET : égal à, parmi (valeurs d’enum proposées), de… à…, non vide, ou un jeton relatif (date de travail, avant ou après aujourd’hui, aujourd’hui, utilisateur courant). Un OU entre champs se décrit en « calculé par code » ;</w:t>
+      </w:r>
+    </w:p>
+    <w:p>
+      <w:pPr>
+        <w:pStyle w:val="ListParagraph"/>
+        <w:numPr>
+          <w:ilvl w:val="0"/>
+          <w:numId w:val="2"/>
+        </w:numPr>
+        <w:spacing w:after="60" w:line="290"/>
+      </w:pPr>
+      <w:r>
+        <w:t xml:space="preserve">la </w:t>
+      </w:r>
+      <w:r>
+        <w:rPr>
+          <w:b/>
+          <w:bCs/>
+        </w:rPr>
+        <w:t xml:space="preserve">page</w:t>
+      </w:r>
+      <w:r>
+        <w:t xml:space="preserve"> ouverte au clic (celle de la table proposée d’abord), le </w:t>
+      </w:r>
+      <w:r>
+        <w:rPr>
+          <w:b/>
+          <w:bCs/>
+        </w:rPr>
+        <w:t xml:space="preserve">groupe</w:t>
+      </w:r>
+      <w:r>
+        <w:t xml:space="preserve"> et la </w:t>
+      </w:r>
+      <w:r>
+        <w:rPr>
+          <w:b/>
+          <w:bCs/>
+        </w:rPr>
+        <w:t xml:space="preserve">largeur</w:t>
+      </w:r>
+      <w:r>
+        <w:t xml:space="preserve">, les </w:t>
+      </w:r>
+      <w:r>
+        <w:rPr>
+          <w:b/>
+          <w:bCs/>
+        </w:rPr>
+        <w:t xml:space="preserve">seuils</w:t>
+      </w:r>
+      <w:r>
+        <w:t xml:space="preserve"> (deux valeurs et un sens), que l’utilisateur peut ajuster ensuite dans *Cue Setup* ; la </w:t>
+      </w:r>
+      <w:r>
+        <w:rPr>
+          <w:b/>
+          <w:bCs/>
+        </w:rPr>
+        <w:t xml:space="preserve">part hôte</w:t>
+      </w:r>
+      <w:r>
+        <w:t xml:space="preserve">, placée ou nouvelle.</w:t>
+      </w:r>
+    </w:p>
+    <w:p>
+      <w:pPr>
+        <w:spacing w:after="140" w:line="300"/>
+      </w:pPr>
+      <w:r>
+        <w:t xml:space="preserve">Le cue est une </w:t>
+      </w:r>
+      <w:r>
+        <w:rPr>
+          <w:b/>
+          <w:bCs/>
+        </w:rPr>
+        <w:t xml:space="preserve">tuile</w:t>
+      </w:r>
+      <w:r>
+        <w:t xml:space="preserve"> en pointillés de sa part, valeur « — ». Une pastille signale ce qui reste </w:t>
+      </w:r>
+      <w:r>
+        <w:rPr>
+          <w:b/>
+          <w:bCs/>
+        </w:rPr>
+        <w:t xml:space="preserve">à préciser</w:t>
+      </w:r>
+      <w:r>
+        <w:t xml:space="preserve"> (caption, valeur, table, filtres) sans rien bloquer, ou une part hôte retirée. Dans le ticket, la section </w:t>
+      </w:r>
+      <w:r>
+        <w:rPr>
+          <w:b/>
+          <w:bCs/>
+        </w:rPr>
+        <w:t xml:space="preserve">Cues à développer</w:t>
+      </w:r>
+      <w:r>
+        <w:t xml:space="preserve"> donne un tableau par part hôte (une nouvelle part est </w:t>
+      </w:r>
+      <w:r>
+        <w:rPr>
+          <w:b/>
+          <w:bCs/>
+        </w:rPr>
+        <w:t xml:space="preserve">à créer</w:t>
+      </w:r>
+      <w:r>
+        <w:t xml:space="preserve">), captions françaises et noms AL côte à côte.</w:t>
+      </w:r>
+    </w:p>
+    <w:p>
+      <w:pPr>
+        <w:spacing w:after="140" w:line="300"/>
+      </w:pPr>
+      <w:r>
         <w:rPr>
           <w:b/>
           <w:bCs/>
@@ -7747,7 +8179,7 @@
         <w:t xml:space="preserve">Mettre à jour le ticket</w:t>
       </w:r>
       <w:r>
-        <w:t xml:space="preserve"> met à jour) un brouillon de ticket lié, avec la composition, les éléments à développer, les traductions anglaises à fournir et le squelette en blocs de code ; on le publie depuis le panneau Ticket.</w:t>
+        <w:t xml:space="preserve"> met à jour) un brouillon de ticket lié, avec la composition, les éléments et les cues à développer, les traductions anglaises à fournir et le squelette en blocs de code ; on le publie depuis le panneau Ticket.</w:t>
       </w:r>
     </w:p>
     <w:p>

</xml_diff>